<commit_message>
Documentación PC2 con enlace al repositorio
</commit_message>
<xml_diff>
--- a/Informe_PC2_SaludCerca.docx
+++ b/Informe_PC2_SaludCerca.docx
@@ -5697,8 +5697,17 @@
         <w:jc w:val="both"/>
       </w:pPr>
       <w:r>
-        <w:t xml:space="preserve">Repositorio de código fuente: pendiente de publicación. La URL real se incorporará después de crear el repositorio y comprobar el acceso del docente.</w:t>
-      </w:r>
+        <w:t xml:space="preserve">Repositorio de código fuente: </w:t>
+      </w:r>
+      <w:hyperlink r:id="rId31">
+        <w:r>
+          <w:rPr>
+            <w:color w:val="0563C1"/>
+            <w:u w:val="single"/>
+          </w:rPr>
+          <w:t>https://github.com/anderjp/SaludCerca_PC2</w:t>
+        </w:r>
+      </w:hyperlink>
     </w:p>
     <w:p>
       <w:pPr>

</xml_diff>